<commit_message>
Restaura as quebras de linha das historias de usuario no Visao
As celulas de "Necessidades (Escopo)" separam as historias com <br>. O
leitor gfm do pandoc entrega isso como HTML bruto e o escritor docx
descarta HTML bruto em silencio, entao as tres historias de cada celula
saiam emendadas num paragrafo corrido -- seis ocorrencias no documento.

Regera o .docx com um filtro Lua que converte <br> em LineBreak e
registra a armadilha no CLAUDE.md, porque a receita documentada ali
reproduzia o defeito e o tamanho do arquivo nao denuncia o problema.
</commit_message>
<xml_diff>
--- a/1.Requisitos/CARREGAJA - Visão.docx
+++ b/1.Requisitos/CARREGAJA - Visão.docx
@@ -1329,7 +1329,13 @@
               <w:t xml:space="preserve">Como síndico, eu quero apurar o consumo de energia de cada apartamento no período, de modo que eu possa lançar o valor na cota condominial.</w:t>
             </w:r>
             <w:r>
+              <w:br/>
+            </w:r>
+            <w:r>
               <w:t xml:space="preserve">Como síndico, eu quero definir a tarifa por quilowatt-hora do rateio, de modo que o valor cobrado acompanhe a conta de luz da área comum.</w:t>
+            </w:r>
+            <w:r>
+              <w:br/>
             </w:r>
             <w:r>
               <w:t xml:space="preserve">Como morador, eu quero acompanhar meu consumo acumulado no mês, de modo que eu saiba quanto será lançado antes de receber a conta.</w:t>
@@ -1489,7 +1495,13 @@
               <w:t xml:space="preserve">Como morador, eu quero ver quais vagas estão livres e quais estão ocupadas, de modo que eu não desça à garagem à toa.</w:t>
             </w:r>
             <w:r>
+              <w:br/>
+            </w:r>
+            <w:r>
               <w:t xml:space="preserve">Como morador, eu quero ver a previsão de liberação das vagas ocupadas, de modo que eu possa decidir quando descer.</w:t>
+            </w:r>
+            <w:r>
+              <w:br/>
             </w:r>
             <w:r>
               <w:t xml:space="preserve">Como morador, eu quero ocupar uma vaga livre e registrar o uso na hora em que chego, de modo que o painel reflita a garagem real para os demais.</w:t>
@@ -1690,7 +1702,13 @@
               <w:t xml:space="preserve">Como morador, eu quero cadastrar meu veículo com a capacidade da bateria e a potência máxima de recarga, de modo que o sistema calcule previsões corretas para mim.</w:t>
             </w:r>
             <w:r>
+              <w:br/>
+            </w:r>
+            <w:r>
               <w:t xml:space="preserve">Como morador, eu quero informar o nível atual da bateria ao iniciar a recarga, de modo que o sistema estime quando ela será concluída.</w:t>
+            </w:r>
+            <w:r>
+              <w:br/>
             </w:r>
             <w:r>
               <w:t xml:space="preserve">Como morador, eu quero que a previsão da minha recarga fique visível aos demais, de modo que quem espera saiba quando a vaga será liberada.</w:t>
@@ -1866,7 +1884,13 @@
               <w:t xml:space="preserve">Como morador, eu quero que exista um limite máximo de duração para qualquer sessão, de modo que nenhuma ocupação se estenda indefinidamente.</w:t>
             </w:r>
             <w:r>
+              <w:br/>
+            </w:r>
+            <w:r>
               <w:t xml:space="preserve">Como morador, eu quero ver no painel que uma sessão já concluiu a recarga ou ultrapassou o limite, de modo que eu saiba que a vaga deveria estar sendo liberada.</w:t>
+            </w:r>
+            <w:r>
+              <w:br/>
             </w:r>
             <w:r>
               <w:t xml:space="preserve">Como síndico, eu quero identificar as sessões que ultrapassaram o limite, de modo que eu possa intervir junto ao morador.</w:t>
@@ -2070,6 +2094,9 @@
               <w:t xml:space="preserve">Como síndico, eu quero identificar as sessões abertas muito além do tempo previsto de conclusão, de modo que eu possa encerrá-las e liberar a vaga.</w:t>
             </w:r>
             <w:r>
+              <w:br/>
+            </w:r>
+            <w:r>
               <w:t xml:space="preserve">Como síndico, eu quero que o encerramento administrativo fique registrado, de modo que o morador possa contestar a apuração.</w:t>
             </w:r>
           </w:p>
@@ -2225,6 +2252,9 @@
             </w:pPr>
             <w:r>
               <w:t xml:space="preserve">Como síndico, eu quero consultar o histórico de utilização por vaga, apartamento e período, de modo que eu possa levar dados à assembleia ao propor a ampliação da estrutura.</w:t>
+            </w:r>
+            <w:r>
+              <w:br/>
             </w:r>
             <w:r>
               <w:t xml:space="preserve">Como síndico, eu quero saber quantas vezes um morador tentou iniciar uma recarga e não encontrou vaga, de modo que eu possa dimensionar a demanda reprimida.</w:t>

</xml_diff>